<commit_message>
Polish Studio chat and screens with reviewed skill transfers
</commit_message>
<xml_diff>
--- a/docs/Revenue Partner Studio - Before You Start.docx
+++ b/docs/Revenue Partner Studio - Before You Start.docx
@@ -714,7 +714,7 @@
         <w:rPr>
           <w:b w:val="0"/>
         </w:rPr>
-        <w:t xml:space="preserve"> v0.2.0-beta.1. Each installation is one private workspace. The public demo is simulated, and this release is not shared multitenant SaaS. See the repository's release checks for current installation and reliability evidence.</w:t>
+        <w:t xml:space="preserve"> v0.2.0-beta.2. Each installation is one private workspace. The public demo is simulated, and this release is not shared multitenant SaaS. See the repository's release checks for current installation and reliability evidence.</w:t>
       </w:r>
     </w:p>
     <w:sectPr>
@@ -1440,6 +1440,9 @@
     <w:qFormat/>
     <w:rsid w:val="00FC693F"/>
     <w:pPr>
+      <w:pBdr>
+        <w:bottom w:val="single" w:sz="8" w:space="4" w:color="4F81BD" w:themeColor="accent1"/>
+      </w:pBdr>
       <w:spacing w:after="300" w:line="240" w:lineRule="auto"/>
       <w:contextualSpacing/>
     </w:pPr>

</xml_diff>

<commit_message>
release: add client-ready screen scheduling and setup
</commit_message>
<xml_diff>
--- a/docs/Revenue Partner Studio - Before You Start.docx
+++ b/docs/Revenue Partner Studio - Before You Start.docx
@@ -26,7 +26,7 @@
         <w:rPr>
           <w:b w:val="0"/>
         </w:rPr>
-        <w:t>By Your AI Guy · Preparation guide · Updated September 14, 2026</w:t>
+        <w:t>By Your AI Guy · Preparation guide · Updated September 16, 2026</w:t>
       </w:r>
     </w:p>
     <w:p>
@@ -714,7 +714,7 @@
         <w:rPr>
           <w:b w:val="0"/>
         </w:rPr>
-        <w:t xml:space="preserve"> v0.2.0-beta.2. Each installation is one private workspace. The public demo is simulated, and this release is not shared multitenant SaaS. See the repository's release checks for current installation and reliability evidence.</w:t>
+        <w:t xml:space="preserve"> v0.2.0-beta.3 private-client pilot. Each installation is one private workspace. The public demo is simulated, and this release is not shared multitenant SaaS. Independent recipient installation, live four-screen acceptance and the clean 24-hour qualification remain required before an unconditional client-ready claim. See the repository's release checks for current evidence.</w:t>
       </w:r>
     </w:p>
     <w:sectPr>
@@ -1440,9 +1440,6 @@
     <w:qFormat/>
     <w:rsid w:val="00FC693F"/>
     <w:pPr>
-      <w:pBdr>
-        <w:bottom w:val="single" w:sz="8" w:space="4" w:color="4F81BD" w:themeColor="accent1"/>
-      </w:pBdr>
       <w:spacing w:after="300" w:line="240" w:lineRule="auto"/>
       <w:contextualSpacing/>
     </w:pPr>

</xml_diff>